<commit_message>
Progreso: ensayo v6 (≤5pp), web React (visor MD, autores, st-lang), UX índice
- Ensayo v6 recortado a ≤5 páginas en formato de entrega (TNR 12 / 1.5 / 2.54 cm); citas verificadas.
- Web Vite/React: índice colapsable con lectura cómoda, visor de Markdown (/lectura) para los materiales, sección 'Autores y fuentes' con resúmenes citados, PDF descargable, presentación animada y ejecución en vivo de lógica formal (st-lang, /api/st).
- Materiales del repositorio como referencia + README.

Co-Authored-By: Claude Opus 4.8 (1M context) <noreply@anthropic.com>
</commit_message>
<xml_diff>
--- a/ensayo/Ensayo_Final.docx
+++ b/ensayo/Ensayo_Final.docx
@@ -53,12 +53,12 @@
         <w:t>Gorgias</w:t>
       </w:r>
       <w:r>
-        <w:t xml:space="preserve"> contiene la confrontación más extensa de Platón con la retórica como práctica política y educativa. En la Atenas democrática del siglo V la palabra era casi la única vía de acción política —ῥήτωρ designa por igual al orador y al político—, de modo que atacar la retórica era atacar la política misma. Sobre ese trasfondo, Sócrates define la retórica como «adulación» (κολακεία) y «práctica empírica» (ἐμπειρία), nunca como arte (τέχνη) (462b–466a). La distinción es estrictamente epistemológica: una τέχνη tiene (1) un objeto propio, (2) procede con razón y da cuenta de sus principios (λόγον ἔχει), (3) conoce sus causas (αἰτίαι) y (4) orienta su acción al bien (ἀγαθόν) de su objeto; una ἐμπειρία repite lo que produce placer sin tener «ningún fundamento por el que ofrecer las cosas que ella ofrece» (465a), esto es, sin poder decir la causa.</w:t>
+        <w:t xml:space="preserve"> contiene la confrontación más extensa de Platón con la retórica como práctica política y educativa. En la Atenas democrática del siglo V la palabra era casi la única vía de acción política, de modo que atacar la retórica era atacar la política misma. Sobre ese trasfondo, Sócrates define la retórica como «adulación» (κολακεία) y «práctica empírica» (ἐμπειρία), nunca como arte (τέχνη) (462b–466a). La distinción es estrictamente epistemológica: una τέχνη tiene (1) un objeto propio, (2) procede con razón y da cuenta de sus principios (λόγον ἔχει), (3) conoce sus causas (αἰτίαι) y (4) orienta su acción al bien (ἀγαθόν) de su objeto; una ἐμπειρία repite lo que produce placer sin tener «ningún fundamento por el que ofrecer las cosas que ella ofrece» (465a), esto es, sin poder decir la causa.</w:t>
       </w:r>
     </w:p>
     <w:p>
       <w:r>
-        <w:t xml:space="preserve">Defiendo una hipótesis que no abandona ese marco, sino que lo toma en serio: </w:t>
+        <w:t xml:space="preserve">Defiendo una hipótesis que no abandona ese marco: </w:t>
       </w:r>
       <w:r>
         <w:rPr>
@@ -67,16 +67,7 @@
         <w:t>acepto la jerarquía socrática —las τέχναι son superiores a las ἐμπειρίαι—, pero disputo que la retórica pertenezca a las segundas</w:t>
       </w:r>
       <w:r>
-        <w:t xml:space="preserve">. Por </w:t>
-      </w:r>
-      <w:r>
-        <w:rPr>
-          <w:i/>
-        </w:rPr>
-        <w:t>defensa analítica</w:t>
-      </w:r>
-      <w:r>
-        <w:t xml:space="preserve"> entiendo verificar la retórica frente a los cuatro criterios que el propio Sócrates fija, sin introducir ontología nueva ni categorías ajenas a Platón. El eje es la </w:t>
+        <w:t xml:space="preserve">. El eje es la </w:t>
       </w:r>
       <w:r>
         <w:rPr>
@@ -85,7 +76,7 @@
         <w:t>Retórica</w:t>
       </w:r>
       <w:r>
-        <w:t xml:space="preserve"> de Aristóteles, que da de la disciplina la teoría sistemática que Sócrates presupone inexistente; la refuerzo con dos anacronismos </w:t>
+        <w:t xml:space="preserve"> de Aristóteles, la refuerzo con dos anacronismos </w:t>
       </w:r>
       <w:r>
         <w:rPr>
@@ -112,7 +103,7 @@
         <w:t>solo</w:t>
       </w:r>
       <w:r>
-        <w:t xml:space="preserve"> para el conocimiento de causas. Ninguno toca la orientación al bien, cuestión normativa que ninguna ciencia descriptiva puede zanjar.</w:t>
+        <w:t xml:space="preserve"> para el conocimiento de causas.</w:t>
       </w:r>
     </w:p>
     <w:p>
@@ -123,7 +114,7 @@
         <w:t>Pregunta central:</w:t>
       </w:r>
       <w:r>
-        <w:t xml:space="preserve"> ¿puede mostrarse, dentro del marco epistemológico del propio Sócrates, que la retórica es τέχνη y no ἐμπειρία, en virtud de su objeto propio, sus principios racionales, su conocimiento de causas y su orientación al bien? Procedo en tres movimientos: reconstruyo el problema en los tres interlocutores, muestro que la clasificación de 462b–466a es arbitraria y verifico los cuatro requisitos, deteniéndome en el último, donde la objeción socrática es más fuerte.</w:t>
+        <w:t xml:space="preserve"> ¿puede mostrarse, dentro del marco epistemológico del propio Sócrates, que la retórica es τέχνη y no ἐμπειρία, en virtud de su objeto propio, sus principios racionales, su conocimiento de causas y su orientación al bien?</w:t>
       </w:r>
     </w:p>
     <w:p>
@@ -135,7 +126,15 @@
           <w:b/>
           <w:sz w:val="26"/>
         </w:rPr>
-        <w:t>§1. El problema: retórica, poder y alma en los tres interlocutores</w:t>
+        <w:t xml:space="preserve">El problema y la clasificación del </w:t>
+      </w:r>
+      <w:r>
+        <w:rPr>
+          <w:b/>
+          <w:i/>
+          <w:sz w:val="26"/>
+        </w:rPr>
+        <w:t>Gorgias</w:t>
       </w:r>
     </w:p>
     <w:p>
@@ -146,7 +145,7 @@
         <w:t>Gorgias</w:t>
       </w:r>
       <w:r>
-        <w:t xml:space="preserve"> (447a–461b) define la retórica como arte de la persuasión y la proclama «el mayor bien», pues da poder sin ser experto en cada materia (452d–456a). Sócrates le arranca que produce «creencia sin el saber», no «ciencia» (454e); y cuando Gorgias añade que enseña a usarla con justicia, lo atrapa: quien aprende lo justo es justo, luego el discípulo no podría obrar mal (460a–c). La refutación es elegante, pero —lo veremos— descansa sobre una premisa de contrabando: que la retórica </w:t>
+        <w:t xml:space="preserve"> (447a–461b) define la retórica como arte de la persuasión y la proclama «el mayor bien», pues da poder sin ser experto en cada materia (452d–456a). Sócrates le arranca que produce «creencia sin el saber», no «ciencia» (454e). La refutación es elegante, pero descansa sobre una premisa de contrabando: que la retórica </w:t>
       </w:r>
       <w:r>
         <w:rPr>
@@ -166,16 +165,7 @@
         <w:t>Polo</w:t>
       </w:r>
       <w:r>
-        <w:t xml:space="preserve"> (461b–481b) abandona el arte y se queda con el poder desnudo: el retórico y el tirano hacen «lo que les parece» (δοκεῖ) y son los más felices. Sócrates replica que no hacen lo que </w:t>
-      </w:r>
-      <w:r>
-        <w:rPr>
-          <w:i/>
-        </w:rPr>
-        <w:t>quieren</w:t>
-      </w:r>
-      <w:r>
-        <w:t xml:space="preserve"> (βούλεται), y que cometer injusticia es peor que padecerla. </w:t>
+        <w:t xml:space="preserve"> (461b–481b) abandona el arte y se queda con el poder desnudo. </w:t>
       </w:r>
       <w:r>
         <w:rPr>
@@ -184,7 +174,7 @@
         <w:t>Calicles</w:t>
       </w:r>
       <w:r>
-        <w:t xml:space="preserve"> (481b–527e) radicaliza: opone φύσις a νόμος y cifra la vida buena en el placer sin freno; en su boca la retórica es el instrumento con que el fuerte somete la asamblea a su apetito: el riesgo democrático en estado puro. Frente a él, Sócrates establece —y no solo afirma— que el bien del alma es su orden (κόσμος): como todo artesano impone a su materia un orden y una proporción, «una casa con orden [...] es buena, pero sin orden es mala» (504a); del orden del alma resultan «la justicia y la moderación» (σωφροσύνη, 504d), de suerte que «un alma moderada es buena» (506e–507a) y el placer sin freno de Calicles es, literalmente, lo </w:t>
+        <w:t xml:space="preserve"> (481b–527e) radicaliza: opone φύσις a νόμος; en su boca la retórica es el instrumento con que el fuerte somete la asamblea a su apetito: el riesgo democrático en estado puro. Frente a él, Sócrates establece que el bien del alma es su orden (κόσμος): «una casa con orden [...] es buena, pero sin orden es mala» (504a); del orden del alma resultan «la justicia y la moderación» (σωφροσύνη, 504d), de suerte que «un alma moderada es buena» (506e–507a) y el placer sin freno de Calicles es, literalmente, lo </w:t>
       </w:r>
       <w:r>
         <w:rPr>
@@ -193,29 +183,12 @@
         <w:t>des</w:t>
       </w:r>
       <w:r>
-        <w:t>-ordenado (508a). La conclusión no se presupone: se sigue de la equiparación de la virtud con el orden que él mismo concedió. Retendré ese riesgo —no la tesis de Calicles— para el §3.4: la retórica-τέχνη puede, en el agente injusto, ser el peligro que él celebra.</w:t>
+        <w:t>-ordenado (508a).</w:t>
       </w:r>
     </w:p>
     <w:p>
       <w:r>
-        <w:t>Acepto, con Sócrates, que el cinismo de Polo y el desenfreno de Calicles son indefendibles; pero ninguna de esas tesis normativas es la retórica: son usos de la palabra, no su esencia. Mi defensa no rescata al hombre, sino el arte que tergiversa.</w:t>
-      </w:r>
-    </w:p>
-    <w:p>
-      <w:pPr>
-        <w:spacing w:before="200"/>
-      </w:pPr>
-      <w:r>
-        <w:rPr>
-          <w:b/>
-          <w:sz w:val="26"/>
-        </w:rPr>
-        <w:t>§2. La clasificación de 462b–466a es arbitraria</w:t>
-      </w:r>
-    </w:p>
-    <w:p>
-      <w:r>
-        <w:t>Sócrates clasifica la retórica como ἐμπειρία equiparándola a la cocina: como la culinaria simula a la medicina dando placer sin salud, la retórica simula a la justicia dando placer al pueblo sin hacerlo mejor; es «un simulacro de una parte de la política» (463d) que «no se ocupa del bien» (464d). Impecable, pero descansa sobre dos movimientos no probados que el resto del ensayo desmonta.</w:t>
+        <w:t>Sócrates clasifica la retórica como ἐμπειρία equiparándola a la cocina: como la culinaria simula a la medicina dando placer sin salud, la retórica simula a la justicia: es «un simulacro de una parte de la política» (463d) que «no se ocupa del bien» (464d).</w:t>
       </w:r>
     </w:p>
     <w:p>
@@ -224,18 +197,6 @@
           <w:b/>
         </w:rPr>
         <w:t>Primero, reduce el objeto de la retórica a «lo justo y lo injusto».</w:t>
-      </w:r>
-      <w:r>
-        <w:t xml:space="preserve"> Al forzar a Gorgias a precisar sobre qué persuade, fija el campo en «lo justo y lo injusto en los tribunales y las asambleas» (454b–455a), equiparando la retórica entera con un solo género, el judicial. El propio texto lo desmiente: el Gorgias que cita a Temístocles y a Pericles aconsejando sobre murallas, puertos y arsenales (455d–e) describe un discurso </w:t>
-      </w:r>
-      <w:r>
-        <w:rPr>
-          <w:i/>
-        </w:rPr>
-        <w:t>deliberativo</w:t>
-      </w:r>
-      <w:r>
-        <w:t xml:space="preserve"> sobre el bien de la ciudad, no un alegato sobre la justicia. La reducción sostiene la analogía con «la justicia, medicina del alma»; el §3.1 mostrará por qué es arbitraria.</w:t>
       </w:r>
     </w:p>
     <w:p>
@@ -264,25 +225,7 @@
         <w:t>uso posible</w:t>
       </w:r>
       <w:r>
-        <w:t xml:space="preserve">, no la naturaleza de la retórica: que algunos oradores persuadan sin saber no implica que la retórica </w:t>
-      </w:r>
-      <w:r>
-        <w:rPr>
-          <w:i/>
-        </w:rPr>
-        <w:t>como tal</w:t>
-      </w:r>
-      <w:r>
-        <w:t xml:space="preserve"> carezca de principios; es una falacia de composición. Y, retirada la reducción del objeto, se disuelve también la refutación de Gorgias: el orador cae en contradicción no por ser retórico, sino por la pretensión —suya, no de la retórica— de enseñar </w:t>
-      </w:r>
-      <w:r>
-        <w:rPr>
-          <w:i/>
-        </w:rPr>
-        <w:t>justicia</w:t>
-      </w:r>
-      <w:r>
-        <w:t>.</w:t>
+        <w:t>, no la naturaleza de la retórica: es una falacia de composición.</w:t>
       </w:r>
     </w:p>
     <w:p>
@@ -294,24 +237,12 @@
           <w:b/>
           <w:sz w:val="26"/>
         </w:rPr>
-        <w:t>§3. Verificación de los cuatro requisitos de τέχνη</w:t>
-      </w:r>
-    </w:p>
-    <w:p>
-      <w:pPr>
-        <w:spacing w:before="160"/>
-      </w:pPr>
-      <w:r>
-        <w:rPr>
-          <w:b/>
-          <w:sz w:val="24"/>
-        </w:rPr>
-        <w:t>3.1 Objeto propio: los tres géneros del discurso</w:t>
+        <w:t>Verificación de los cuatro requisitos de τέχνη</w:t>
       </w:r>
     </w:p>
     <w:p>
       <w:r>
-        <w:t>Una τέχνη exige, ante todo, un objeto propio que la distinga de las demás. Sócrates niega a la retórica un objeto distinto del de la justicia, pero por reducción (§2), no por examen del campo. Aristóteles, en cambio, lo fija con precisión clasificatoria: la retórica se divide en tres géneros, y la división no es estipulativa, sino que se deduce de los tres tipos de oyente —el que decide sobre el futuro, el que juzga sobre el pasado y el mero espectador— (</w:t>
+        <w:t>Una τέχνη exige, ante todo, un objeto propio que la distinga de las demás. Aristóteles: la retórica se divide en tres géneros, y la división se deduce de los tres tipos de oyente (</w:t>
       </w:r>
       <w:r>
         <w:rPr>
@@ -329,21 +260,7 @@
         <w:t>Retórica</w:t>
       </w:r>
       <w:r>
-        <w:t xml:space="preserve"> I, 1358b).</w:t>
-      </w:r>
-    </w:p>
-    <w:p>
-      <w:r>
-        <w:t xml:space="preserve">Esta tripartición revela </w:t>
-      </w:r>
-      <w:r>
-        <w:rPr>
-          <w:i/>
-        </w:rPr>
-        <w:t>por qué</w:t>
-      </w:r>
-      <w:r>
-        <w:t xml:space="preserve"> la clasificación socrática es arbitraria. Sócrates toma uno solo de los géneros —el judicial (454b–455a)— y lo hace pasar por el todo: la falacia de tomar la parte por el conjunto, como quien definiera la medicina por la sola cirugía. La división aristotélica, en cambio, descansa en un principio no arbitrario —la posición del oyente ante el tiempo— y exhibe los dos géneros omitidos, y con ellos un objeto que excede al de la justicia: lo conveniente y lo bello no son especies de lo justo. La retórica no es ni el saber universal que Gorgias presumía (459c) ni la sola justicia, sino el arte que «considera en cada caso lo que es apto para persuadir» (</w:t>
+        <w:t xml:space="preserve"> I, 1358b). Sócrates toma uno solo de los géneros —el judicial (454b–455a)— y lo hace pasar por el todo: la falacia de tomar la parte por el conjunto. La retórica no es ni el saber universal que Gorgias presumía (456a–c) ni la sola justicia, sino el arte que «considera en cada caso lo que es apto para persuadir» (</w:t>
       </w:r>
       <w:r>
         <w:rPr>
@@ -356,20 +273,8 @@
       </w:r>
     </w:p>
     <w:p>
-      <w:pPr>
-        <w:spacing w:before="160"/>
-      </w:pPr>
       <w:r>
-        <w:rPr>
-          <w:b/>
-          <w:sz w:val="24"/>
-        </w:rPr>
-        <w:t>3.2 Principios racionales: ἦθος, πάθος, λόγος y τόποι</w:t>
-      </w:r>
-    </w:p>
-    <w:p>
-      <w:r>
-        <w:t xml:space="preserve">El segundo criterio exige proceder con razón y dar cuenta de lo que se hace (λόγον διδόναι); la </w:t>
+        <w:t>Aristóteles distingue tres pruebas técnicas (</w:t>
       </w:r>
       <w:r>
         <w:rPr>
@@ -378,7 +283,7 @@
         <w:t>Retórica</w:t>
       </w:r>
       <w:r>
-        <w:t xml:space="preserve"> es exactamente eso. Aristóteles distingue tres pruebas técnicas (</w:t>
+        <w:t xml:space="preserve"> I, 1356a): el ἦθος, el πάθος, y el λόγος, que persuade mediante el argumento. Suma los τόποι, y el entimema que llama «cuerpo de la prueba» (σῶμα τῆς πίστεως, </w:t>
       </w:r>
       <w:r>
         <w:rPr>
@@ -387,30 +292,7 @@
         <w:t>Retórica</w:t>
       </w:r>
       <w:r>
-        <w:t xml:space="preserve"> I, 1356a): el ἦθος, que persuade por el carácter creíble del orador; el πάθος, que dispone emocionalmente al auditorio; y el λόγος, que persuade mediante el argumento. Suma los τόποι, esquemas aplicables a cualquier materia, y el entimema —silogismo retórico de premisas probables—, que llama «cuerpo de la prueba» (σῶμα τῆς πίστεως, </w:t>
-      </w:r>
-      <w:r>
-        <w:rPr>
-          <w:i/>
-        </w:rPr>
-        <w:t>Retórica</w:t>
-      </w:r>
-      <w:r>
-        <w:t xml:space="preserve"> I, 1354a). Un arte que clasifica sus medios y enseña a construir argumentos no persuade por azar.</w:t>
-      </w:r>
-    </w:p>
-    <w:p>
-      <w:r>
-        <w:t xml:space="preserve">Aquí —y </w:t>
-      </w:r>
-      <w:r>
-        <w:rPr>
-          <w:i/>
-        </w:rPr>
-        <w:t>solo</w:t>
-      </w:r>
-      <w:r>
-        <w:t xml:space="preserve"> aquí— introduzco el primer anacronismo. Perelman y Olbrechts-Tyteca, en </w:t>
+        <w:t xml:space="preserve"> I, 1354a). Perelman y Olbrechts-Tyteca, en </w:t>
       </w:r>
       <w:r>
         <w:rPr>
@@ -428,21 +310,7 @@
         <w:t>auditorio universal</w:t>
       </w:r>
       <w:r>
-        <w:t xml:space="preserve"> ofrece un criterio: un argumento es racional en la medida en que podría aceptarlo todo ser razonable, no solo el público al que se halaga. No es un público empírico, sino un </w:t>
-      </w:r>
-      <w:r>
-        <w:rPr>
-          <w:b/>
-        </w:rPr>
-        <w:t>ideal regulativo</w:t>
-      </w:r>
-      <w:r>
-        <w:t xml:space="preserve"> que distingue la razón compartida de la complacencia: un patrón de validez que no depende del aplauso.</w:t>
-      </w:r>
-    </w:p>
-    <w:p>
-      <w:r>
-        <w:t>Conviene, para no apoyar el criterio en una sola voz, contrastar a Perelman con otra de la teoría de la argumentación. Si Perelman aporta un patrón de validez, Toulmin (</w:t>
+        <w:t xml:space="preserve"> ofrece un criterio: un argumento es racional en la medida en que podría aceptarlo todo ser razonable, no solo el público al que se halaga. Toulmin (</w:t>
       </w:r>
       <w:r>
         <w:rPr>
@@ -478,28 +346,7 @@
         <w:t>backing</w:t>
       </w:r>
       <w:r>
-        <w:t xml:space="preserve">)—, donde el </w:t>
-      </w:r>
-      <w:r>
-        <w:rPr>
-          <w:i/>
-        </w:rPr>
-        <w:t>backing</w:t>
-      </w:r>
-      <w:r>
-        <w:t xml:space="preserve"> es la respuesta articulada a «¿por qué de ahí se sigue esto?»: la prueba misma de que la retórica puede dar cuenta de su proceder (λόγον διδόναι). Que el dato sea contingente y la garantía revisable no la vuelve irracional —blanco común de ambos contra el ἄλογον socrático—: esa garantía no es sino la premisa callada del entimema aristotélico. Segundo criterio satisfecho.</w:t>
-      </w:r>
-    </w:p>
-    <w:p>
-      <w:pPr>
-        <w:spacing w:before="160"/>
-      </w:pPr>
-      <w:r>
-        <w:rPr>
-          <w:b/>
-          <w:sz w:val="24"/>
-        </w:rPr>
-        <w:t>3.3 Conocimiento de causas: las αἰτίαι de la persuasión</w:t>
+        <w:t>)—. Segundo criterio satisfecho.</w:t>
       </w:r>
     </w:p>
     <w:p>
@@ -513,48 +360,7 @@
         <w:t>Retórica</w:t>
       </w:r>
       <w:r>
-        <w:t xml:space="preserve"> es un tratado causal de las pasiones: cada πάθος se define por la disposición del sujeto, su objeto y sus circunstancias. La ira, por caso, es «un deseo de venganza acompañado de dolor, por un desprecio manifiesto e injustificado» (</w:t>
-      </w:r>
-      <w:r>
-        <w:rPr>
-          <w:i/>
-        </w:rPr>
-        <w:t>Retórica</w:t>
-      </w:r>
-      <w:r>
-        <w:t xml:space="preserve"> II, 1378a); quien tiene esa definición sabe </w:t>
-      </w:r>
-      <w:r>
-        <w:rPr>
-          <w:i/>
-        </w:rPr>
-        <w:t>por qué</w:t>
-      </w:r>
-      <w:r>
-        <w:t xml:space="preserve"> surge y </w:t>
-      </w:r>
-      <w:r>
-        <w:rPr>
-          <w:i/>
-        </w:rPr>
-        <w:t>cómo</w:t>
-      </w:r>
-      <w:r>
-        <w:t xml:space="preserve"> suscitarla o calmarla. Lo mismo vale para el argumento, cuyo mecanismo —entimema y ejemplo, probabilidad (εἰκός) y signo (σημεῖον)— Aristóteles explica, no solo constata.</w:t>
-      </w:r>
-    </w:p>
-    <w:p>
-      <w:r>
-        <w:t xml:space="preserve">Refuerzo este punto —y </w:t>
-      </w:r>
-      <w:r>
-        <w:rPr>
-          <w:i/>
-        </w:rPr>
-        <w:t>solo</w:t>
-      </w:r>
-      <w:r>
-        <w:t xml:space="preserve"> este— con Cialdini, que da contenido empírico a esas αἰτίαι. En </w:t>
+        <w:t xml:space="preserve"> es un tratado causal de las pasiones. En </w:t>
       </w:r>
       <w:r>
         <w:rPr>
@@ -563,7 +369,7 @@
         <w:t>Influence</w:t>
       </w:r>
       <w:r>
-        <w:t xml:space="preserve"> (1984) sistematiza seis principios de persuasión (reciprocidad, coherencia, prueba social, autoridad, simpatía y escasez) e identifica el </w:t>
+        <w:t xml:space="preserve"> (1984) sistematiza seis principios de persuasión e identifica el </w:t>
       </w:r>
       <w:r>
         <w:rPr>
@@ -572,42 +378,24 @@
         <w:t>mecanismo</w:t>
       </w:r>
       <w:r>
-        <w:t xml:space="preserve"> causal de cada uno: opera como un atajo cognitivo —el sujeto responde a un disparador fijo que suele correlacionar con una buena decisión— y esa regularidad se mide en experimentos controlados que predicen la tasa de asentimiento. La αἰτία deja así de ser conjetura: es una causa que se manipula, se mide y se replica —exactamente lo que el «no puede decir la causa» de 465a le niega—. El anacronismo queda acotado por el propio Aristóteles, cuyo libro II ya tematiza causalmente algunos de esos resortes —la autoridad en el ἦθος, el favor (χάρις) como reciprocidad—: Cialdini no los crea, sino que cuantifica lo que Aristóteles describía. Y lo confino al conocimiento de causas: saber </w:t>
-      </w:r>
-      <w:r>
-        <w:rPr>
-          <w:i/>
-        </w:rPr>
-        <w:t>por qué</w:t>
-      </w:r>
-      <w:r>
-        <w:t xml:space="preserve"> alguien se deja persuadir nada dice sobre si </w:t>
-      </w:r>
-      <w:r>
-        <w:rPr>
-          <w:i/>
-        </w:rPr>
-        <w:t>debe</w:t>
-      </w:r>
-      <w:r>
-        <w:t xml:space="preserve"> persuadírselo. Tercer criterio satisfecho.</w:t>
+        <w:t xml:space="preserve"> causal de cada uno: Cialdini no los crea, sino que cuantifica lo que Aristóteles describía. Tercer criterio satisfecho.</w:t>
       </w:r>
     </w:p>
     <w:p>
       <w:pPr>
-        <w:spacing w:before="160"/>
+        <w:spacing w:before="200"/>
       </w:pPr>
       <w:r>
         <w:rPr>
           <w:b/>
-          <w:sz w:val="24"/>
+          <w:sz w:val="26"/>
         </w:rPr>
-        <w:t>3.4 Orientación al bien: el criterio decisivo</w:t>
+        <w:t>Orientación al bien: el criterio decisivo</w:t>
       </w:r>
     </w:p>
     <w:p>
       <w:r>
-        <w:t>Es el criterio más exigente y el núcleo del ensayo. Sócrates sostiene que la retórica «pone su punto de mira en el placer sin el bien» (464d–465a). Lo enfrento en su forma fuerte, como una cadena de tres preguntas.</w:t>
+        <w:t>Sócrates sostiene que la retórica «pone su punto de mira en el placer sin el bien» (464d–465a). Lo enfrento en su forma fuerte, como una cadena de tres preguntas.</w:t>
       </w:r>
     </w:p>
     <w:p>
@@ -618,16 +406,7 @@
         <w:t>(a) ¿Cómo puede la retórica orientarse al bien si no lo conoce?</w:t>
       </w:r>
       <w:r>
-        <w:t xml:space="preserve"> La pregunta supone que «orientarse al bien» es </w:t>
-      </w:r>
-      <w:r>
-        <w:rPr>
-          <w:i/>
-        </w:rPr>
-        <w:t>poseer la ciencia normativa que determina qué es lo justo</w:t>
-      </w:r>
-      <w:r>
-        <w:t>; pero el criterio no exige tanto, y ninguna τέχνη lo cumpliría así. Aristóteles distingue la τέχνη —ordenada a producir algo distinto de sí— de la φρόνησις, sabiduría práctica del bien en la acción (</w:t>
+        <w:t xml:space="preserve"> Aristóteles distingue la τέχνη de la φρόνησις (</w:t>
       </w:r>
       <w:r>
         <w:rPr>
@@ -636,16 +415,7 @@
         <w:t>Ética a Nicómaco</w:t>
       </w:r>
       <w:r>
-        <w:t xml:space="preserve"> VI, 1140a–b); y porque la técnica no es la φρόνησις, puede emplearse mal: el dominio del arte no incluye la rectitud del fin. Cada arte se ordena a un </w:t>
-      </w:r>
-      <w:r>
-        <w:rPr>
-          <w:b/>
-        </w:rPr>
-        <w:t>fin propio</w:t>
-      </w:r>
-      <w:r>
-        <w:t xml:space="preserve"> del que sí da cuenta —la medicina, de la salud—. La retórica no establece qué es lo conveniente o lo justo —eso toca a la política y la ética, de las que toma sus premisas (</w:t>
+        <w:t xml:space="preserve"> VI, 1140a–b); y porque la técnica no es la φρόνησις, puede emplearse mal: el dominio del arte no incluye la rectitud del fin. La retórica no establece qué es lo conveniente o lo justo —eso toca a la política y la ética, de las que toma sus premisas (</w:t>
       </w:r>
       <w:r>
         <w:rPr>
@@ -663,22 +433,13 @@
         <w:t>Retórica</w:t>
       </w:r>
       <w:r>
-        <w:t xml:space="preserve"> I, 1366a), </w:t>
+        <w:t xml:space="preserve"> I, 1358b), </w:t>
       </w:r>
       <w:r>
         <w:rPr>
           <w:b/>
         </w:rPr>
         <w:t>conoce los medios para persuadir respecto de él</w:t>
-      </w:r>
-      <w:r>
-        <w:t xml:space="preserve">. No el bien mismo, pues, sino </w:t>
-      </w:r>
-      <w:r>
-        <w:rPr>
-          <w:b/>
-        </w:rPr>
-        <w:t>su fin propio y los medios que a él conducen</w:t>
       </w:r>
       <w:r>
         <w:t>.</w:t>
@@ -728,16 +489,19 @@
         <w:t>es</w:t>
       </w:r>
       <w:r>
-        <w:t xml:space="preserve"> la virtud que lo realiza. Converge con la justicia en su materia —lo justo, en lo judicial— sin coincidir en su naturaleza. Al contragolpe más duro —que esa persuasión sería </w:t>
+        <w:t xml:space="preserve"> la virtud que lo realiza.</w:t>
       </w:r>
+    </w:p>
+    <w:p>
+      <w:pPr>
+        <w:spacing w:before="200"/>
+      </w:pPr>
       <w:r>
         <w:rPr>
-          <w:i/>
+          <w:b/>
+          <w:sz w:val="26"/>
         </w:rPr>
-        <w:t>apariencia sin saber</w:t>
-      </w:r>
-      <w:r>
-        <w:t xml:space="preserve"> (454e–455a), πίστις y no ἐπιστήμη— ya respondieron los criterios segundo y tercero: lo que la separa de la cocina-ἐμπειρία es que procede por principios racionales (λόγον ἔχει) y conoce las αἰτίαι del asentimiento. No es simulacro ciego.</w:t>
+        <w:t>Objeción y respuesta</w:t>
       </w:r>
     </w:p>
     <w:p>
@@ -748,16 +512,7 @@
         <w:t>(c) ¿Entonces el retórico nunca podría actuar injustamente? Y si nunca, ¿no deja de ser la retórica un riesgo para la democracia?</w:t>
       </w:r>
       <w:r>
-        <w:t xml:space="preserve"> Es una </w:t>
-      </w:r>
-      <w:r>
-        <w:rPr>
-          <w:i/>
-        </w:rPr>
-        <w:t>trampa simétrica</w:t>
-      </w:r>
-      <w:r>
-        <w:t xml:space="preserve">: afirmar que su orientación al bien la vuelve incapaz de daño la volvería inocua, contra la premisa del comienzo. No caigo en ella. La pregunta descansa en el </w:t>
+        <w:t xml:space="preserve"> La pregunta descansa en el </w:t>
       </w:r>
       <w:r>
         <w:rPr>
@@ -766,16 +521,7 @@
         <w:t>intelectualismo socrático</w:t>
       </w:r>
       <w:r>
-        <w:t xml:space="preserve"> (460a–c): quien conoce lo justo nunca obrará mal. No necesito negar esa doctrina, pues ni se aplica al caso: la inferencia solo vale si lo que el retórico conoce </w:t>
-      </w:r>
-      <w:r>
-        <w:rPr>
-          <w:i/>
-        </w:rPr>
-        <w:t>es</w:t>
-      </w:r>
-      <w:r>
-        <w:t xml:space="preserve"> la virtud que realiza el bien, pero (a) y (b) mostraron que conoce los </w:t>
+        <w:t xml:space="preserve"> (460a–c): quien conoce lo justo nunca obrará mal. (a) y (b) mostraron que conoce los </w:t>
       </w:r>
       <w:r>
         <w:rPr>
@@ -784,7 +530,7 @@
         <w:t>medios</w:t>
       </w:r>
       <w:r>
-        <w:t xml:space="preserve"> para persuadir respecto de un fin, no la φρόνησις ni la justicia. Falta su antecedente. Conocer los medios </w:t>
+        <w:t xml:space="preserve"> para persuadir respecto de un fin, no la φρόνησις ni la justicia. Conocer los medios </w:t>
       </w:r>
       <w:r>
         <w:rPr>
@@ -793,7 +539,7 @@
         <w:t>no garantiza el buen uso del arte</w:t>
       </w:r>
       <w:r>
-        <w:t>, porque ninguna τέχνη lo garantiza: el médico que conoce la salud conoce con ello el veneno, y los medios sirven a fines opuestos según la voluntad del agente —su carácter (ἦθος)—, no según su técnica.</w:t>
+        <w:t>, porque ninguna τέχνη lo garantiza: los medios sirven a fines opuestos según la voluntad del agente —su carácter (ἦθος)—, no según su técnica.</w:t>
       </w:r>
     </w:p>
     <w:p>
@@ -834,7 +580,7 @@
         <w:t>agente</w:t>
       </w:r>
       <w:r>
-        <w:t xml:space="preserve"> (su elección). Que el retórico pueda manipular al pueblo no prueba que la retórica no sea arte, sino lo contrario: solo un arte que conoce de veras las causas del asentimiento puede ser peligroso, pues la mera ἐμπειρία, ciega a ellas, no podría manipular con método. El peligro de la retórica es, paradójicamente, consecuencia de que es τέχνη. La objeción del cuarto criterio descansaba en dos presuposiciones —exigir que la sola posesión asegure el buen uso e identificar su objeto con el de la justicia—; retiradas ambas, queda satisfecho.</w:t>
+        <w:t xml:space="preserve"> (su elección). Que el retórico pueda manipular al pueblo no prueba que la retórica no sea arte, sino lo contrario: solo un arte que conoce de veras las causas del asentimiento puede ser peligroso. El peligro de la retórica es, paradójicamente, consecuencia de que es τέχνη.</w:t>
       </w:r>
     </w:p>
     <w:p>
@@ -869,16 +615,7 @@
         <w:t>principios racionales</w:t>
       </w:r>
       <w:r>
-        <w:t xml:space="preserve"> —ἦθος, πάθος, λόγος y τόποι—, cuya racionalidad confirman el auditorio universal de Perelman y el </w:t>
-      </w:r>
-      <w:r>
-        <w:rPr>
-          <w:i/>
-        </w:rPr>
-        <w:t>layout</w:t>
-      </w:r>
-      <w:r>
-        <w:t xml:space="preserve"> de Toulmin; conoce sus </w:t>
+        <w:t xml:space="preserve"> —ἦθος, πάθος, λόγος y τόποι—, conoce sus </w:t>
       </w:r>
       <w:r>
         <w:rPr>
@@ -887,7 +624,7 @@
         <w:t>causas</w:t>
       </w:r>
       <w:r>
-        <w:t xml:space="preserve">, las αἰτίαι de las pasiones y los argumentos, corroboradas por Cialdini; y se </w:t>
+        <w:t xml:space="preserve">, y se </w:t>
       </w:r>
       <w:r>
         <w:rPr>
@@ -896,7 +633,7 @@
         <w:t>orienta a su fin propio</w:t>
       </w:r>
       <w:r>
-        <w:t xml:space="preserve"> —deliberar, juzgar y educar bien— sin confundirse con la justicia. Ese cuarto criterio es el aporte distintivo: la retórica se ordena a su fin bueno y, a la vez, no asegura su buen uso, de modo que conserva la posibilidad del mal uso que la mantiene como poder real —y como riesgo— en la ciudad. La retórica es, pues, τέχνη y no ἐμπειρία. No abandono el marco de Sócrates: lo aplico con el rigor que él reclama, examinando la cosa y no la caricatura que de ella trazan sus adversarios.</w:t>
+        <w:t xml:space="preserve"> sin confundirse con la justicia. La retórica es, pues, τέχνη y no ἐμπειρία. No abandono el marco de Sócrates: lo aplico con el rigor que él reclama, examinando la cosa y no la caricatura que de ella trazan sus adversarios.</w:t>
       </w:r>
     </w:p>
     <w:p>

</xml_diff>

<commit_message>
docx: regenerar Ensayo_Final.docx con v6.1
Co-Authored-By: Claude Opus 4.8 (1M context) <noreply@anthropic.com>
</commit_message>
<xml_diff>
--- a/ensayo/Ensayo_Final.docx
+++ b/ensayo/Ensayo_Final.docx
@@ -351,7 +351,7 @@
     </w:p>
     <w:p>
       <w:r>
-        <w:t xml:space="preserve">El tercer criterio —el que Sócrates niega con más énfasis al decir que la retórica no puede «decir la causa» (465a)— exige conocer las αἰτίαι de lo que se produce. El libro II de la </w:t>
+        <w:t xml:space="preserve">El tercer criterio —el que Sócrates niega con más énfasis al decir que la retórica no puede «decir la causa» (465a)— exige conocer las αἰτίαι de lo que se produce. Quien las expone es Aristóteles: el libro II de la </w:t>
       </w:r>
       <w:r>
         <w:rPr>
@@ -360,7 +360,16 @@
         <w:t>Retórica</w:t>
       </w:r>
       <w:r>
-        <w:t xml:space="preserve"> es un tratado causal de las pasiones. En </w:t>
+        <w:t xml:space="preserve"> es un tratado causal de las pasiones —qué es cada una, ante quién y por qué se siente— que da </w:t>
+      </w:r>
+      <w:r>
+        <w:rPr>
+          <w:i/>
+        </w:rPr>
+        <w:t>razón</w:t>
+      </w:r>
+      <w:r>
+        <w:t xml:space="preserve"> de cada efecto; por eso es saber de causas y no la ἐμπειρία que Sócrates denuncia. Cialdini (</w:t>
       </w:r>
       <w:r>
         <w:rPr>
@@ -369,16 +378,16 @@
         <w:t>Influence</w:t>
       </w:r>
       <w:r>
-        <w:t xml:space="preserve"> (1984) sistematiza seis principios de persuasión e identifica el </w:t>
+        <w:t xml:space="preserve">, 1984) no funda ese conocimiento: solo </w:t>
       </w:r>
       <w:r>
         <w:rPr>
           <w:i/>
         </w:rPr>
-        <w:t>mecanismo</w:t>
+        <w:t>cuantifica</w:t>
       </w:r>
       <w:r>
-        <w:t xml:space="preserve"> causal de cada uno: Cialdini no los crea, sino que cuantifica lo que Aristóteles describía. Tercer criterio satisfecho.</w:t>
+        <w:t xml:space="preserve"> con método experimental lo que Aristóteles ya explicaba —confirma, no descubre—. Tercer criterio satisfecho.</w:t>
       </w:r>
     </w:p>
     <w:p>
@@ -395,7 +404,34 @@
     </w:p>
     <w:p>
       <w:r>
-        <w:t>Sócrates sostiene que la retórica «pone su punto de mira en el placer sin el bien» (464d–465a). Lo enfrento en su forma fuerte, como una cadena de tres preguntas.</w:t>
+        <w:t xml:space="preserve">Sócrates sostiene que la retórica «pone su punto de mira en el placer sin el bien» (464d–465a). Pero, a diferencia de la cocina, no procura el placer </w:t>
+      </w:r>
+      <w:r>
+        <w:rPr>
+          <w:i/>
+        </w:rPr>
+        <w:t>sorteando</w:t>
+      </w:r>
+      <w:r>
+        <w:t xml:space="preserve"> el juicio, sino el asentimiento </w:t>
+      </w:r>
+      <w:r>
+        <w:rPr>
+          <w:i/>
+        </w:rPr>
+        <w:t>mediante</w:t>
+      </w:r>
+      <w:r>
+        <w:t xml:space="preserve"> λόγος dirigido a él: su fin propio no es la gratificación ciega, sino la </w:t>
+      </w:r>
+      <w:r>
+        <w:rPr>
+          <w:b/>
+        </w:rPr>
+        <w:t>convicción razonada</w:t>
+      </w:r>
+      <w:r>
+        <w:t xml:space="preserve"> —un bien del alma que la adulación jamás toca, y que disuelve la paridad con la culinaria—. Lo enfrento en su forma fuerte, como una cadena de tres preguntas.</w:t>
       </w:r>
     </w:p>
     <w:p>

</xml_diff>

<commit_message>
ensayo(v6.2): resolver los 6 hallazgos de la auditoría adversarial (H1-H6)
- H1 (núcleo): declara explícita la REINTERPRETACIÓN del 4.º criterio (fin propio,
  no ciencia del Bien) y la defiende (ninguna τέχνη cumple la versión fuerte)
- H2 (validez): «peligroso» -> «manipular con método» (cierra exceso probatorio)
- H3 (economía): Perelman/Toulmin con función real (auditorio universal; backing=λόγον διδόναι)
- H4 (adversario): ancla «convicción razonada» en el auditorio que juzga
- H5 (autoconsistencia): concilia §2 con §Orientación (converge en lo judicial)
- H6 (carga de prueba): la conclusión marca el 4.º criterio «en su versión defendible»
- Compensado con recortes solo-borrado: 1488 palabras (≤1490), 5 páginas, verify OK
- Espejado en web/src/content/essay.jsx; PDF/DOCX/espejo materiales regenerados
- Registro completo en bitácora (tabla H1-H6 + resolución). Pendiente voz del autor

Co-Authored-By: Claude Opus 4.8 (1M context) <noreply@anthropic.com>
</commit_message>
<xml_diff>
--- a/ensayo/Ensayo_Final.docx
+++ b/ensayo/Ensayo_Final.docx
@@ -53,7 +53,7 @@
         <w:t>Gorgias</w:t>
       </w:r>
       <w:r>
-        <w:t xml:space="preserve"> contiene la confrontación más extensa de Platón con la retórica como práctica política y educativa. En la Atenas democrática del siglo V la palabra era casi la única vía de acción política, de modo que atacar la retórica era atacar la política misma. Sobre ese trasfondo, Sócrates define la retórica como «adulación» (κολακεία) y «práctica empírica» (ἐμπειρία), nunca como arte (τέχνη) (462b–466a). La distinción es estrictamente epistemológica: una τέχνη tiene (1) un objeto propio, (2) procede con razón y da cuenta de sus principios (λόγον ἔχει), (3) conoce sus causas (αἰτίαι) y (4) orienta su acción al bien (ἀγαθόν) de su objeto; una ἐμπειρία repite lo que produce placer sin tener «ningún fundamento por el que ofrecer las cosas que ella ofrece» (465a), esto es, sin poder decir la causa.</w:t>
+        <w:t xml:space="preserve"> contiene la confrontación más extensa de Platón con la retórica como práctica política y educativa. En la Atenas democrática la palabra era casi la única vía de acción política: atacar la retórica era atacar la política misma. Sobre ese trasfondo, Sócrates define la retórica como «adulación» (κολακεία) y «práctica empírica» (ἐμπειρία), nunca como arte (τέχνη) (462b–466a). La distinción es estrictamente epistemológica: una τέχνη tiene (1) un objeto propio, (2) procede con razón y da cuenta de sus principios (λόγον ἔχει), (3) conoce sus causas (αἰτίαι) y (4) orienta su acción al bien (ἀγαθόν) de su objeto; una ἐμπειρία repite lo que produce placer sin poder decir su causa (465a).</w:t>
       </w:r>
     </w:p>
     <w:p>
@@ -114,7 +114,7 @@
         <w:t>Pregunta central:</w:t>
       </w:r>
       <w:r>
-        <w:t xml:space="preserve"> ¿puede mostrarse, dentro del marco epistemológico del propio Sócrates, que la retórica es τέχνη y no ἐμπειρία, en virtud de su objeto propio, sus principios racionales, su conocimiento de causas y su orientación al bien?</w:t>
+        <w:t xml:space="preserve"> ¿puede mostrarse, dentro del marco epistemológico del propio Sócrates, que la retórica satisface los cuatro criterios de τέχνη y no es una ἐμπειρία?</w:t>
       </w:r>
     </w:p>
     <w:p>
@@ -174,7 +174,7 @@
         <w:t>Calicles</w:t>
       </w:r>
       <w:r>
-        <w:t xml:space="preserve"> (481b–527e) radicaliza: opone φύσις a νόμος; en su boca la retórica es el instrumento con que el fuerte somete la asamblea a su apetito: el riesgo democrático en estado puro. Frente a él, Sócrates establece que el bien del alma es su orden (κόσμος): «una casa con orden [...] es buena, pero sin orden es mala» (504a); del orden del alma resultan «la justicia y la moderación» (σωφροσύνη, 504d), de suerte que «un alma moderada es buena» (506e–507a) y el placer sin freno de Calicles es, literalmente, lo </w:t>
+        <w:t xml:space="preserve"> (481b–527e) radicaliza: opone φύσις a νόμος; en su boca la retórica es el instrumento con que el fuerte somete la asamblea a su apetito: el riesgo democrático en estado puro. Frente a él, Sócrates establece que el bien del alma es su orden (κόσμος): del orden resultan «la justicia y la moderación» (σωφροσύνη, 504d), de suerte que «un alma moderada es buena» (506e–507a), y el placer sin freno de Calicles es lo </w:t>
       </w:r>
       <w:r>
         <w:rPr>
@@ -251,7 +251,7 @@
         <w:t>Retórica</w:t>
       </w:r>
       <w:r>
-        <w:t xml:space="preserve"> I, 1358a–b). El deliberativo (συμβουλευτικόν) versa sobre lo conveniente y mira al futuro de la ciudad; el judicial (δικανικόν), sobre lo justo y lo injusto en un hecho pasado; el epidíctico (ἐπιδεικτικόν), sobre lo bello y lo feo, mediante elogio y censura (</w:t>
+        <w:t xml:space="preserve"> I, 1358a–b). El deliberativo (συμβουλευτικόν) versa sobre lo conveniente; el judicial (δικανικόν), sobre lo justo y lo injusto; el epidíctico (ἐπιδεικτικόν), sobre lo bello y lo feo (</w:t>
       </w:r>
       <w:r>
         <w:rPr>
@@ -260,7 +260,7 @@
         <w:t>Retórica</w:t>
       </w:r>
       <w:r>
-        <w:t xml:space="preserve"> I, 1358b). Sócrates toma uno solo de los géneros —el judicial (454b–455a)— y lo hace pasar por el todo: la falacia de tomar la parte por el conjunto. La retórica no es ni el saber universal que Gorgias presumía (456a–c) ni la sola justicia, sino el arte que «considera en cada caso lo que es apto para persuadir» (</w:t>
+        <w:t xml:space="preserve"> I, 1358b). Sócrates toma uno solo —el judicial (454b–455a)— por el todo: la falacia de tomar la parte por el conjunto. La retórica no es ni el saber universal que Gorgias presumía (456a–c) ni la sola justicia, sino el arte que «considera en cada caso lo que es apto para persuadir» (</w:t>
       </w:r>
       <w:r>
         <w:rPr>
@@ -292,7 +292,7 @@
         <w:t>Retórica</w:t>
       </w:r>
       <w:r>
-        <w:t xml:space="preserve"> I, 1354a). Perelman y Olbrechts-Tyteca, en </w:t>
+        <w:t xml:space="preserve"> I, 1354a). Perelman y Olbrechts-Tyteca (</w:t>
       </w:r>
       <w:r>
         <w:rPr>
@@ -301,7 +301,7 @@
         <w:t>La nueva retórica</w:t>
       </w:r>
       <w:r>
-        <w:t xml:space="preserve"> (1958), muestran que la argumentación posee una racionalidad propia, irreductible a la lógica formal y no por ello arbitraria. Su </w:t>
+        <w:t xml:space="preserve">, 1958) muestran que la argumentación tiene racionalidad propia y no arbitraria: su </w:t>
       </w:r>
       <w:r>
         <w:rPr>
@@ -310,7 +310,7 @@
         <w:t>auditorio universal</w:t>
       </w:r>
       <w:r>
-        <w:t xml:space="preserve"> ofrece un criterio: un argumento es racional en la medida en que podría aceptarlo todo ser razonable, no solo el público al que se halaga. Toulmin (</w:t>
+        <w:t xml:space="preserve"> —lo aceptable por todo ser razonable, no por el público que se halaga— es el criterio de esa racionalidad. Toulmin (</w:t>
       </w:r>
       <w:r>
         <w:rPr>
@@ -319,25 +319,7 @@
         <w:t>Los usos del argumento</w:t>
       </w:r>
       <w:r>
-        <w:t xml:space="preserve">, 1958) aporta una </w:t>
-      </w:r>
-      <w:r>
-        <w:rPr>
-          <w:i/>
-        </w:rPr>
-        <w:t>anatomía</w:t>
-      </w:r>
-      <w:r>
-        <w:t>: el argumento práctico tiene estructura analizable —dato, garantía (</w:t>
-      </w:r>
-      <w:r>
-        <w:rPr>
-          <w:i/>
-        </w:rPr>
-        <w:t>warrant</w:t>
-      </w:r>
-      <w:r>
-        <w:t>) y respaldo (</w:t>
+        <w:t xml:space="preserve">, 1958) responde al cargo de informalidad lógica del entimema: su </w:t>
       </w:r>
       <w:r>
         <w:rPr>
@@ -346,7 +328,16 @@
         <w:t>backing</w:t>
       </w:r>
       <w:r>
-        <w:t>)—. Segundo criterio satisfecho.</w:t>
+        <w:t xml:space="preserve"> (respaldo) es cómo la retórica </w:t>
+      </w:r>
+      <w:r>
+        <w:rPr>
+          <w:b/>
+        </w:rPr>
+        <w:t>da razón</w:t>
+      </w:r>
+      <w:r>
+        <w:t xml:space="preserve"> de la garantía —el λόγον διδόναι que Sócrates reclama—. Segundo criterio satisfecho.</w:t>
       </w:r>
     </w:p>
     <w:p>
@@ -431,7 +422,16 @@
         <w:t>convicción razonada</w:t>
       </w:r>
       <w:r>
-        <w:t xml:space="preserve"> —un bien del alma que la adulación jamás toca, y que disuelve la paridad con la culinaria—. Lo enfrento en su forma fuerte, como una cadena de tres preguntas.</w:t>
+        <w:t xml:space="preserve">, un bien del alma que la adulación no toca. ¿Y qué separa esa convicción de la </w:t>
+      </w:r>
+      <w:r>
+        <w:rPr>
+          <w:i/>
+        </w:rPr>
+        <w:t>manipulada</w:t>
+      </w:r>
+      <w:r>
+        <w:t>, que también usa palabras? El auditorio que juzga: la retórica-τέχνη se dirige a un oyente capaz de sopesar razones y disentir —el «auditorio universal» de Perelman como ideal regulativo—, mientras la adulación explota resortes que sortean ese juicio. Enfrento la objeción en su forma fuerte, como una cadena de tres preguntas.</w:t>
       </w:r>
     </w:p>
     <w:p>
@@ -478,7 +478,16 @@
         <w:t>conoce los medios para persuadir respecto de él</w:t>
       </w:r>
       <w:r>
-        <w:t>.</w:t>
+        <w:t xml:space="preserve">. Reinterpreto aquí el cuarto criterio: exigir que la retórica </w:t>
+      </w:r>
+      <w:r>
+        <w:rPr>
+          <w:i/>
+        </w:rPr>
+        <w:t>conozca el Bien</w:t>
+      </w:r>
+      <w:r>
+        <w:t xml:space="preserve"> es pedirle lo que ninguna τέχνη cumple —tampoco la medicina posee la ciencia del Bien, y no por ello deja de ser arte—; basta que se ordene a su fin propio. Exigírselo solo a la retórica sería la arbitrariedad que ya denuncié.</w:t>
       </w:r>
     </w:p>
     <w:p>
@@ -516,7 +525,7 @@
         <w:t>discursos persuasivos sobre lo conveniente, lo justo y lo bello</w:t>
       </w:r>
       <w:r>
-        <w:t xml:space="preserve">: conoce los medios para persuadir respecto del fin, pero no </w:t>
+        <w:t xml:space="preserve"> —converge con la justicia en parte de su materia (lo justo, en lo judicial) sin agotarse en ella (§2)—: conoce los medios para persuadir respecto del fin, pero no </w:t>
       </w:r>
       <w:r>
         <w:rPr>
@@ -616,7 +625,16 @@
         <w:t>agente</w:t>
       </w:r>
       <w:r>
-        <w:t xml:space="preserve"> (su elección). Que el retórico pueda manipular al pueblo no prueba que la retórica no sea arte, sino lo contrario: solo un arte que conoce de veras las causas del asentimiento puede ser peligroso. El peligro de la retórica es, paradójicamente, consecuencia de que es τέχνη.</w:t>
+        <w:t xml:space="preserve"> (su elección). Que el retórico pueda manipular al pueblo no prueba que la retórica no sea arte, sino lo contrario: solo quien conoce de veras las causas del asentimiento puede manipular </w:t>
+      </w:r>
+      <w:r>
+        <w:rPr>
+          <w:i/>
+        </w:rPr>
+        <w:t>con método</w:t>
+      </w:r>
+      <w:r>
+        <w:t>. Ese peligro sistemático es, paradójicamente, consecuencia de que la retórica es τέχνη.</w:t>
       </w:r>
     </w:p>
     <w:p>
@@ -660,7 +678,7 @@
         <w:t>causas</w:t>
       </w:r>
       <w:r>
-        <w:t xml:space="preserve">, y se </w:t>
+        <w:t xml:space="preserve">, y —en la versión defendible del cuarto criterio, la que ninguna τέχνη cumple en su forma fuerte— se </w:t>
       </w:r>
       <w:r>
         <w:rPr>
@@ -669,7 +687,7 @@
         <w:t>orienta a su fin propio</w:t>
       </w:r>
       <w:r>
-        <w:t xml:space="preserve"> sin confundirse con la justicia. La retórica es, pues, τέχνη y no ἐμπειρία. No abandono el marco de Sócrates: lo aplico con el rigor que él reclama, examinando la cosa y no la caricatura que de ella trazan sus adversarios.</w:t>
+        <w:t xml:space="preserve"> sin confundirse con la justicia. La retórica es, pues, τέχνη y no ἐμπειρία. No abandono el marco de Sócrates: lo aplico con el rigor que él reclama, examinando la cosa y no la caricatura de sus adversarios.</w:t>
       </w:r>
     </w:p>
     <w:p>

</xml_diff>